<commit_message>
feat(omml): fix 09_bar and 10_limit OMML + all-10 Word COM measured
</commit_message>
<xml_diff>
--- a/tools/fixtures/omml_samples/09_bar.docx
+++ b/tools/fixtures/omml_samples/09_bar.docx
@@ -12,7 +12,7 @@
         <w:rPr>
           <w:sz w:val="24"/>
         </w:rPr>
-        <w:t xml:space="preserve">Fixture: overline (bar) on x</w:t>
+        <w:t xml:space="preserve">Fixture: overline (bar) on x (no pos = default top)</w:t>
       </w:r>
     </w:p>
     <w:p>
@@ -27,9 +27,6 @@
         </m:oMathParaPr>
         <m:oMath>
           <m:bar>
-            <m:barPr>
-              <m:pos m:val="top"/>
-            </m:barPr>
             <m:e>
               <m:r>
                 <m:t>x</m:t>

</xml_diff>